<commit_message>
Docker with fastapi code
</commit_message>
<xml_diff>
--- a/Documentation/Section31_Docker_with_Fastapi.docx
+++ b/Documentation/Section31_Docker_with_Fastapi.docx
@@ -3,7 +3,6 @@
 <w:document xmlns:wpc="http://schemas.microsoft.com/office/word/2010/wordprocessingCanvas" xmlns:cx="http://schemas.microsoft.com/office/drawing/2014/chartex" xmlns:cx1="http://schemas.microsoft.com/office/drawing/2015/9/8/chartex" xmlns:mc="http://schemas.openxmlformats.org/markup-compatibility/2006" xmlns:o="urn:schemas-microsoft-com:office:office" xmlns:r="http://schemas.openxmlformats.org/officeDocument/2006/relationships" xmlns:m="http://schemas.openxmlformats.org/officeDocument/2006/math" xmlns:v="urn:schemas-microsoft-com:vml" xmlns:wp14="http://schemas.microsoft.com/office/word/2010/wordprocessingDrawing" xmlns:wp="http://schemas.openxmlformats.org/drawingml/2006/wordprocessingDrawing" xmlns:w10="urn:schemas-microsoft-com:office:word" xmlns:w="http://schemas.openxmlformats.org/wordprocessingml/2006/main" xmlns:w14="http://schemas.microsoft.com/office/word/2010/wordml" xmlns:w15="http://schemas.microsoft.com/office/word/2012/wordml" xmlns:w16se="http://schemas.microsoft.com/office/word/2015/wordml/symex" xmlns:wpg="http://schemas.microsoft.com/office/word/2010/wordprocessingGroup" xmlns:wpi="http://schemas.microsoft.com/office/word/2010/wordprocessingInk" xmlns:wne="http://schemas.microsoft.com/office/word/2006/wordml" xmlns:wps="http://schemas.microsoft.com/office/word/2010/wordprocessingShape" mc:Ignorable="w14 w15 w16se wp14">
   <w:body>
     <w:p>
-      <w:bookmarkStart w:id="0" w:name="_GoBack"/>
       <w:r>
         <w:t xml:space="preserve">Docker with Fastapi </w:t>
       </w:r>
@@ -7207,6 +7206,8 @@
       <w:r>
         <w:t xml:space="preserve"> </w:t>
       </w:r>
+      <w:bookmarkStart w:id="0" w:name="_GoBack"/>
+      <w:bookmarkEnd w:id="0"/>
     </w:p>
     <w:p>
       <w:r>
@@ -7887,30 +7888,8 @@
         <w:t xml:space="preserve">important thing Note: if we do change any  requirements.txt add or remove than we need to rebuild like docker-compose down and than follow the process </w:t>
       </w:r>
     </w:p>
-    <w:p>
-      <w:r>
-        <w:t>Step17:</w:t>
-      </w:r>
-    </w:p>
-    <w:p/>
-    <w:p>
-      <w:r>
-        <w:t>Step18:</w:t>
-      </w:r>
-    </w:p>
-    <w:p>
-      <w:r>
-        <w:t>Step19:</w:t>
-      </w:r>
-    </w:p>
-    <w:p>
-      <w:r>
-        <w:t>Step20:</w:t>
-      </w:r>
-    </w:p>
     <w:p/>
     <w:p/>
-    <w:bookmarkEnd w:id="0"/>
     <w:p/>
     <w:sectPr>
       <w:pgSz w:w="12240" w:h="15840"/>

</xml_diff>